<commit_message>
Preparar datos y etiquetas para la CNN
</commit_message>
<xml_diff>
--- a/Semana6.docx
+++ b/Semana6.docx
@@ -20,8 +20,6 @@
         </w:rPr>
         <w:t>Semana 6</w:t>
       </w:r>
-      <w:bookmarkStart w:id="0" w:name="_GoBack"/>
-      <w:bookmarkEnd w:id="0"/>
     </w:p>
     <w:p>
       <w:pPr>
@@ -145,15 +143,7 @@
           <w:sz w:val="24"/>
           <w:szCs w:val="24"/>
         </w:rPr>
-        <w:t>valores de intensidad se encue</w:t>
-      </w:r>
-      <w:r>
-        <w:rPr>
-          <w:rFonts w:ascii="Arial" w:hAnsi="Arial" w:cs="Arial"/>
-          <w:sz w:val="24"/>
-          <w:szCs w:val="24"/>
-        </w:rPr>
-        <w:t>ntren normalizados entre 0 y 1.</w:t>
+        <w:t>valores de intensidad se encuentren normalizados entre 0 y 1.</w:t>
       </w:r>
       <w:r>
         <w:rPr>
@@ -198,6 +188,224 @@
           <w:szCs w:val="24"/>
         </w:rPr>
         <w:t>.</w:t>
+      </w:r>
+    </w:p>
+    <w:p>
+      <w:pPr>
+        <w:jc w:val="both"/>
+        <w:rPr>
+          <w:rFonts w:ascii="Arial" w:hAnsi="Arial" w:cs="Arial"/>
+          <w:sz w:val="24"/>
+          <w:szCs w:val="24"/>
+        </w:rPr>
+      </w:pPr>
+    </w:p>
+    <w:p>
+      <w:pPr>
+        <w:jc w:val="both"/>
+        <w:rPr>
+          <w:rFonts w:ascii="Arial" w:hAnsi="Arial" w:cs="Arial"/>
+          <w:sz w:val="24"/>
+          <w:szCs w:val="24"/>
+        </w:rPr>
+      </w:pPr>
+      <w:proofErr w:type="spellStart"/>
+      <w:r>
+        <w:rPr>
+          <w:rFonts w:ascii="Arial" w:hAnsi="Arial" w:cs="Arial"/>
+          <w:sz w:val="24"/>
+          <w:szCs w:val="24"/>
+        </w:rPr>
+        <w:t>feat</w:t>
+      </w:r>
+      <w:proofErr w:type="spellEnd"/>
+      <w:r>
+        <w:rPr>
+          <w:rFonts w:ascii="Arial" w:hAnsi="Arial" w:cs="Arial"/>
+          <w:sz w:val="24"/>
+          <w:szCs w:val="24"/>
+        </w:rPr>
+        <w:t>: preparar datos y etiquetas para la CNN</w:t>
+      </w:r>
+    </w:p>
+    <w:p>
+      <w:pPr>
+        <w:jc w:val="both"/>
+        <w:rPr>
+          <w:rFonts w:ascii="Arial" w:hAnsi="Arial" w:cs="Arial"/>
+          <w:sz w:val="24"/>
+          <w:szCs w:val="24"/>
+        </w:rPr>
+      </w:pPr>
+      <w:r>
+        <w:rPr>
+          <w:rFonts w:ascii="Arial" w:hAnsi="Arial" w:cs="Arial"/>
+          <w:sz w:val="24"/>
+          <w:szCs w:val="24"/>
+        </w:rPr>
+        <w:t xml:space="preserve">Se prepararon los datos que </w:t>
+      </w:r>
+      <w:r>
+        <w:rPr>
+          <w:rFonts w:ascii="Arial" w:hAnsi="Arial" w:cs="Arial"/>
+          <w:sz w:val="24"/>
+          <w:szCs w:val="24"/>
+        </w:rPr>
+        <w:t xml:space="preserve">serán utilizados posteriormente </w:t>
+      </w:r>
+      <w:r>
+        <w:rPr>
+          <w:rFonts w:ascii="Arial" w:hAnsi="Arial" w:cs="Arial"/>
+          <w:sz w:val="24"/>
+          <w:szCs w:val="24"/>
+        </w:rPr>
+        <w:t>para entrenar</w:t>
+      </w:r>
+      <w:r>
+        <w:rPr>
+          <w:rFonts w:ascii="Arial" w:hAnsi="Arial" w:cs="Arial"/>
+          <w:sz w:val="24"/>
+          <w:szCs w:val="24"/>
+        </w:rPr>
+        <w:t xml:space="preserve"> la red neuronal </w:t>
+      </w:r>
+      <w:proofErr w:type="spellStart"/>
+      <w:r>
+        <w:rPr>
+          <w:rFonts w:ascii="Arial" w:hAnsi="Arial" w:cs="Arial"/>
+          <w:sz w:val="24"/>
+          <w:szCs w:val="24"/>
+        </w:rPr>
+        <w:t>convolucional</w:t>
+      </w:r>
+      <w:proofErr w:type="spellEnd"/>
+      <w:r>
+        <w:rPr>
+          <w:rFonts w:ascii="Arial" w:hAnsi="Arial" w:cs="Arial"/>
+          <w:sz w:val="24"/>
+          <w:szCs w:val="24"/>
+        </w:rPr>
+        <w:t xml:space="preserve">. </w:t>
+      </w:r>
+      <w:r>
+        <w:rPr>
+          <w:rFonts w:ascii="Arial" w:hAnsi="Arial" w:cs="Arial"/>
+          <w:sz w:val="24"/>
+          <w:szCs w:val="24"/>
+        </w:rPr>
+        <w:t>Las radiografías se organiz</w:t>
+      </w:r>
+      <w:r>
+        <w:rPr>
+          <w:rFonts w:ascii="Arial" w:hAnsi="Arial" w:cs="Arial"/>
+          <w:sz w:val="24"/>
+          <w:szCs w:val="24"/>
+        </w:rPr>
+        <w:t xml:space="preserve">aron en las categorías NORMAL y </w:t>
+      </w:r>
+      <w:r>
+        <w:rPr>
+          <w:rFonts w:ascii="Arial" w:hAnsi="Arial" w:cs="Arial"/>
+          <w:sz w:val="24"/>
+          <w:szCs w:val="24"/>
+        </w:rPr>
+        <w:t xml:space="preserve">PNEUMONIA y se configuró </w:t>
+      </w:r>
+      <w:proofErr w:type="spellStart"/>
+      <w:r>
+        <w:rPr>
+          <w:rFonts w:ascii="Arial" w:hAnsi="Arial" w:cs="Arial"/>
+          <w:sz w:val="24"/>
+          <w:szCs w:val="24"/>
+        </w:rPr>
+        <w:t>Tens</w:t>
+      </w:r>
+      <w:r>
+        <w:rPr>
+          <w:rFonts w:ascii="Arial" w:hAnsi="Arial" w:cs="Arial"/>
+          <w:sz w:val="24"/>
+          <w:szCs w:val="24"/>
+        </w:rPr>
+        <w:t>orFlow</w:t>
+      </w:r>
+      <w:proofErr w:type="spellEnd"/>
+      <w:r>
+        <w:rPr>
+          <w:rFonts w:ascii="Arial" w:hAnsi="Arial" w:cs="Arial"/>
+          <w:sz w:val="24"/>
+          <w:szCs w:val="24"/>
+        </w:rPr>
+        <w:t xml:space="preserve"> para cargar las </w:t>
+      </w:r>
+      <w:proofErr w:type="spellStart"/>
+      <w:r>
+        <w:rPr>
+          <w:rFonts w:ascii="Arial" w:hAnsi="Arial" w:cs="Arial"/>
+          <w:sz w:val="24"/>
+          <w:szCs w:val="24"/>
+        </w:rPr>
+        <w:t>imágene</w:t>
+      </w:r>
+      <w:proofErr w:type="spellEnd"/>
+      <w:r>
+        <w:rPr>
+          <w:rFonts w:ascii="Arial" w:hAnsi="Arial" w:cs="Arial"/>
+          <w:sz w:val="24"/>
+          <w:szCs w:val="24"/>
+        </w:rPr>
+        <w:t xml:space="preserve"> </w:t>
+      </w:r>
+      <w:r>
+        <w:rPr>
+          <w:rFonts w:ascii="Arial" w:hAnsi="Arial" w:cs="Arial"/>
+          <w:sz w:val="24"/>
+          <w:szCs w:val="24"/>
+        </w:rPr>
+        <w:t>con un tamaño de 224x224 píxeles y en l</w:t>
+      </w:r>
+      <w:bookmarkStart w:id="0" w:name="_GoBack"/>
+      <w:bookmarkEnd w:id="0"/>
+      <w:r>
+        <w:rPr>
+          <w:rFonts w:ascii="Arial" w:hAnsi="Arial" w:cs="Arial"/>
+          <w:sz w:val="24"/>
+          <w:szCs w:val="24"/>
+        </w:rPr>
+        <w:t>otes de datos.</w:t>
+      </w:r>
+    </w:p>
+    <w:p>
+      <w:pPr>
+        <w:jc w:val="both"/>
+        <w:rPr>
+          <w:rFonts w:ascii="Arial" w:hAnsi="Arial" w:cs="Arial"/>
+          <w:sz w:val="24"/>
+          <w:szCs w:val="24"/>
+        </w:rPr>
+      </w:pPr>
+      <w:r>
+        <w:rPr>
+          <w:rFonts w:ascii="Arial" w:hAnsi="Arial" w:cs="Arial"/>
+          <w:sz w:val="24"/>
+          <w:szCs w:val="24"/>
+        </w:rPr>
+        <w:t xml:space="preserve">También se verificaron las </w:t>
+      </w:r>
+      <w:r>
+        <w:rPr>
+          <w:rFonts w:ascii="Arial" w:hAnsi="Arial" w:cs="Arial"/>
+          <w:sz w:val="24"/>
+          <w:szCs w:val="24"/>
+        </w:rPr>
+        <w:t xml:space="preserve">clases y las dimensiones de los </w:t>
+      </w:r>
+      <w:r>
+        <w:rPr>
+          <w:rFonts w:ascii="Arial" w:hAnsi="Arial" w:cs="Arial"/>
+          <w:sz w:val="24"/>
+          <w:szCs w:val="24"/>
+        </w:rPr>
+        <w:t>datos cargados.</w:t>
       </w:r>
     </w:p>
     <w:p>

</xml_diff>

<commit_message>
Crear modelo CNN para clasificacion
</commit_message>
<xml_diff>
--- a/Semana6.docx
+++ b/Semana6.docx
@@ -361,17 +361,7 @@
           <w:sz w:val="24"/>
           <w:szCs w:val="24"/>
         </w:rPr>
-        <w:t>con un tamaño de 224x224 píxeles y en l</w:t>
-      </w:r>
-      <w:bookmarkStart w:id="0" w:name="_GoBack"/>
-      <w:bookmarkEnd w:id="0"/>
-      <w:r>
-        <w:rPr>
-          <w:rFonts w:ascii="Arial" w:hAnsi="Arial" w:cs="Arial"/>
-          <w:sz w:val="24"/>
-          <w:szCs w:val="24"/>
-        </w:rPr>
-        <w:t>otes de datos.</w:t>
+        <w:t>con un tamaño de 224x224 píxeles y en lotes de datos.</w:t>
       </w:r>
     </w:p>
     <w:p>
@@ -425,6 +415,196 @@
           <w:szCs w:val="24"/>
         </w:rPr>
       </w:pPr>
+      <w:proofErr w:type="spellStart"/>
+      <w:r>
+        <w:rPr>
+          <w:rFonts w:ascii="Arial" w:hAnsi="Arial" w:cs="Arial"/>
+          <w:sz w:val="24"/>
+          <w:szCs w:val="24"/>
+        </w:rPr>
+        <w:t>feat</w:t>
+      </w:r>
+      <w:proofErr w:type="spellEnd"/>
+      <w:r>
+        <w:rPr>
+          <w:rFonts w:ascii="Arial" w:hAnsi="Arial" w:cs="Arial"/>
+          <w:sz w:val="24"/>
+          <w:szCs w:val="24"/>
+        </w:rPr>
+        <w:t xml:space="preserve">: crear modelo CNN para </w:t>
+      </w:r>
+      <w:proofErr w:type="spellStart"/>
+      <w:r>
+        <w:rPr>
+          <w:rFonts w:ascii="Arial" w:hAnsi="Arial" w:cs="Arial"/>
+          <w:sz w:val="24"/>
+          <w:szCs w:val="24"/>
+        </w:rPr>
+        <w:t>clasificacion</w:t>
+      </w:r>
+      <w:proofErr w:type="spellEnd"/>
+    </w:p>
+    <w:p>
+      <w:pPr>
+        <w:rPr>
+          <w:rFonts w:ascii="Arial" w:hAnsi="Arial" w:cs="Arial"/>
+          <w:sz w:val="24"/>
+          <w:szCs w:val="24"/>
+        </w:rPr>
+      </w:pPr>
+      <w:r>
+        <w:rPr>
+          <w:rFonts w:ascii="Arial" w:hAnsi="Arial" w:cs="Arial"/>
+          <w:sz w:val="24"/>
+          <w:szCs w:val="24"/>
+        </w:rPr>
+        <w:t>Se desarrolló una prime</w:t>
+      </w:r>
+      <w:r>
+        <w:rPr>
+          <w:rFonts w:ascii="Arial" w:hAnsi="Arial" w:cs="Arial"/>
+          <w:sz w:val="24"/>
+          <w:szCs w:val="24"/>
+        </w:rPr>
+        <w:t xml:space="preserve">ra arquitectura de red neuronal </w:t>
+      </w:r>
+      <w:proofErr w:type="spellStart"/>
+      <w:r>
+        <w:rPr>
+          <w:rFonts w:ascii="Arial" w:hAnsi="Arial" w:cs="Arial"/>
+          <w:sz w:val="24"/>
+          <w:szCs w:val="24"/>
+        </w:rPr>
+        <w:t>convolucional</w:t>
+      </w:r>
+      <w:proofErr w:type="spellEnd"/>
+      <w:r>
+        <w:rPr>
+          <w:rFonts w:ascii="Arial" w:hAnsi="Arial" w:cs="Arial"/>
+          <w:sz w:val="24"/>
+          <w:szCs w:val="24"/>
+        </w:rPr>
+        <w:t xml:space="preserve"> para la clasific</w:t>
+      </w:r>
+      <w:r>
+        <w:rPr>
+          <w:rFonts w:ascii="Arial" w:hAnsi="Arial" w:cs="Arial"/>
+          <w:sz w:val="24"/>
+          <w:szCs w:val="24"/>
+        </w:rPr>
+        <w:t xml:space="preserve">ación de radiografías de tórax. </w:t>
+      </w:r>
+      <w:r>
+        <w:rPr>
+          <w:rFonts w:ascii="Arial" w:hAnsi="Arial" w:cs="Arial"/>
+          <w:sz w:val="24"/>
+          <w:szCs w:val="24"/>
+        </w:rPr>
+        <w:t xml:space="preserve">El modelo incluye capas </w:t>
+      </w:r>
+      <w:proofErr w:type="spellStart"/>
+      <w:r>
+        <w:rPr>
+          <w:rFonts w:ascii="Arial" w:hAnsi="Arial" w:cs="Arial"/>
+          <w:sz w:val="24"/>
+          <w:szCs w:val="24"/>
+        </w:rPr>
+        <w:t>convoluc</w:t>
+      </w:r>
+      <w:r>
+        <w:rPr>
+          <w:rFonts w:ascii="Arial" w:hAnsi="Arial" w:cs="Arial"/>
+          <w:sz w:val="24"/>
+          <w:szCs w:val="24"/>
+        </w:rPr>
+        <w:t>ionales</w:t>
+      </w:r>
+      <w:proofErr w:type="spellEnd"/>
+      <w:r>
+        <w:rPr>
+          <w:rFonts w:ascii="Arial" w:hAnsi="Arial" w:cs="Arial"/>
+          <w:sz w:val="24"/>
+          <w:szCs w:val="24"/>
+        </w:rPr>
+        <w:t xml:space="preserve">, capas de agrupamiento, </w:t>
+      </w:r>
+      <w:r>
+        <w:rPr>
+          <w:rFonts w:ascii="Arial" w:hAnsi="Arial" w:cs="Arial"/>
+          <w:sz w:val="24"/>
+          <w:szCs w:val="24"/>
+        </w:rPr>
+        <w:t xml:space="preserve">una capa </w:t>
+      </w:r>
+      <w:proofErr w:type="spellStart"/>
+      <w:r>
+        <w:rPr>
+          <w:rFonts w:ascii="Arial" w:hAnsi="Arial" w:cs="Arial"/>
+          <w:sz w:val="24"/>
+          <w:szCs w:val="24"/>
+        </w:rPr>
+        <w:t>Flatten</w:t>
+      </w:r>
+      <w:proofErr w:type="spellEnd"/>
+      <w:r>
+        <w:rPr>
+          <w:rFonts w:ascii="Arial" w:hAnsi="Arial" w:cs="Arial"/>
+          <w:sz w:val="24"/>
+          <w:szCs w:val="24"/>
+        </w:rPr>
+        <w:t xml:space="preserve"> y capas densas</w:t>
+      </w:r>
+      <w:r>
+        <w:rPr>
+          <w:rFonts w:ascii="Arial" w:hAnsi="Arial" w:cs="Arial"/>
+          <w:sz w:val="24"/>
+          <w:szCs w:val="24"/>
+        </w:rPr>
+        <w:t xml:space="preserve"> para realizar la clasificación </w:t>
+      </w:r>
+      <w:r>
+        <w:rPr>
+          <w:rFonts w:ascii="Arial" w:hAnsi="Arial" w:cs="Arial"/>
+          <w:sz w:val="24"/>
+          <w:szCs w:val="24"/>
+        </w:rPr>
+        <w:t>entre las categorías NORMAL y PNEUMONIA.</w:t>
+      </w:r>
+    </w:p>
+    <w:p>
+      <w:pPr>
+        <w:rPr>
+          <w:rFonts w:ascii="Arial" w:hAnsi="Arial" w:cs="Arial"/>
+          <w:sz w:val="24"/>
+          <w:szCs w:val="24"/>
+        </w:rPr>
+      </w:pPr>
+      <w:r>
+        <w:rPr>
+          <w:rFonts w:ascii="Arial" w:hAnsi="Arial" w:cs="Arial"/>
+          <w:sz w:val="24"/>
+          <w:szCs w:val="24"/>
+        </w:rPr>
+        <w:t>Esta primera versión servirá</w:t>
+      </w:r>
+      <w:r>
+        <w:rPr>
+          <w:rFonts w:ascii="Arial" w:hAnsi="Arial" w:cs="Arial"/>
+          <w:sz w:val="24"/>
+          <w:szCs w:val="24"/>
+        </w:rPr>
+        <w:t xml:space="preserve"> como modelo base para realizar </w:t>
+      </w:r>
+      <w:bookmarkStart w:id="0" w:name="_GoBack"/>
+      <w:bookmarkEnd w:id="0"/>
+      <w:r>
+        <w:rPr>
+          <w:rFonts w:ascii="Arial" w:hAnsi="Arial" w:cs="Arial"/>
+          <w:sz w:val="24"/>
+          <w:szCs w:val="24"/>
+        </w:rPr>
+        <w:t>posteriormente el entrenamiento y la evaluación del sistema.</w:t>
+      </w:r>
     </w:p>
     <w:sectPr>
       <w:pgSz w:w="12240" w:h="15840"/>

</xml_diff>